<commit_message>
Cover is like this now
</commit_message>
<xml_diff>
--- a/src/beforeIntro/cover/ista_capas_mestrado.docx
+++ b/src/beforeIntro/cover/ista_capas_mestrado.docx
@@ -295,6 +295,7 @@
                                 <w:rFonts w:ascii="Montserrat Regular" w:hAnsi="Montserrat Regular"/>
                                 <w:sz w:val="28"/>
                                 <w:szCs w:val="28"/>
+                                <w:lang w:val="pt-PT"/>
                               </w:rPr>
                             </w:pPr>
                             <w:r>
@@ -302,90 +303,106 @@
                                 <w:rFonts w:ascii="Montserrat Regular" w:hAnsi="Montserrat Regular"/>
                                 <w:sz w:val="28"/>
                                 <w:szCs w:val="28"/>
-                              </w:rPr>
-                              <w:t>Master’s degree</w:t>
+                                <w:lang w:val="pt-PT"/>
+                              </w:rPr>
+                              <w:t>Master’s degree in Artificial Intelligence</w:t>
+                            </w:r>
+                          </w:p>
+                          <w:p>
+                            <w:pPr>
+                              <w:pStyle w:val="Body"/>
+                              <w:rPr>
+                                <w:rFonts w:ascii="Montserrat Regular" w:eastAsia="Montserrat Regular" w:hAnsi="Montserrat Regular" w:cs="Montserrat Regular"/>
+                                <w:sz w:val="28"/>
+                                <w:szCs w:val="28"/>
+                                <w:lang w:val="pt-PT"/>
+                              </w:rPr>
+                            </w:pPr>
+                          </w:p>
+                          <w:p>
+                            <w:pPr>
+                              <w:pStyle w:val="Body"/>
+                              <w:rPr>
+                                <w:rFonts w:ascii="Montserrat Regular" w:eastAsia="Montserrat Regular" w:hAnsi="Montserrat Regular" w:cs="Montserrat Regular"/>
+                                <w:sz w:val="28"/>
+                                <w:szCs w:val="28"/>
+                                <w:lang w:val="pt-PT"/>
+                              </w:rPr>
+                            </w:pPr>
+                          </w:p>
+                          <w:p>
+                            <w:pPr>
+                              <w:pStyle w:val="Body"/>
+                              <w:rPr>
+                                <w:rFonts w:ascii="Montserrat Regular" w:eastAsia="Montserrat Regular" w:hAnsi="Montserrat Regular" w:cs="Montserrat Regular"/>
+                                <w:sz w:val="28"/>
+                                <w:szCs w:val="28"/>
+                                <w:lang w:val="pt-PT"/>
+                              </w:rPr>
+                            </w:pPr>
+                          </w:p>
+                          <w:p>
+                            <w:pPr>
+                              <w:pStyle w:val="Body"/>
+                              <w:rPr>
+                                <w:rFonts w:ascii="Montserrat Regular" w:eastAsia="Montserrat Regular" w:hAnsi="Montserrat Regular" w:cs="Montserrat Regular"/>
+                                <w:sz w:val="28"/>
+                                <w:szCs w:val="28"/>
+                                <w:lang w:val="pt-PT"/>
+                              </w:rPr>
+                            </w:pPr>
+                            <w:r>
+                              <w:rPr>
+                                <w:rFonts w:ascii="Montserrat Regular" w:hAnsi="Montserrat Regular"/>
+                                <w:sz w:val="28"/>
+                                <w:szCs w:val="28"/>
+                                <w:lang w:val="pt-PT"/>
+                              </w:rPr>
+                              <w:t>Supervisor:</w:t>
+                            </w:r>
+                          </w:p>
+                          <w:p>
+                            <w:pPr>
+                              <w:pStyle w:val="Body"/>
+                              <w:rPr>
+                                <w:rFonts w:ascii="Montserrat Regular" w:eastAsia="Montserrat Regular" w:hAnsi="Montserrat Regular" w:cs="Montserrat Regular"/>
+                                <w:sz w:val="28"/>
+                                <w:szCs w:val="28"/>
+                                <w:lang w:val="pt-PT"/>
+                              </w:rPr>
+                            </w:pPr>
+                            <w:r>
+                              <w:rPr>
+                                <w:rFonts w:ascii="Montserrat Regular" w:hAnsi="Montserrat Regular"/>
+                                <w:sz w:val="28"/>
+                                <w:szCs w:val="28"/>
+                                <w:lang w:val="pt-PT"/>
+                              </w:rPr>
+                              <w:t>Prof</w:t>
                             </w:r>
                             <w:r>
                               <w:rPr>
                                 <w:rFonts w:ascii="Montserrat Regular" w:hAnsi="Montserrat Regular"/>
                                 <w:sz w:val="28"/>
                                 <w:szCs w:val="28"/>
-                              </w:rPr>
-                              <w:t xml:space="preserve"> in Artificial Intelligence</w:t>
-                            </w:r>
-                          </w:p>
-                          <w:p>
-                            <w:pPr>
-                              <w:pStyle w:val="Body"/>
-                              <w:rPr>
-                                <w:rFonts w:ascii="Montserrat Regular" w:eastAsia="Montserrat Regular" w:hAnsi="Montserrat Regular" w:cs="Montserrat Regular"/>
-                                <w:sz w:val="28"/>
-                                <w:szCs w:val="28"/>
-                              </w:rPr>
-                            </w:pPr>
-                          </w:p>
-                          <w:p>
-                            <w:pPr>
-                              <w:pStyle w:val="Body"/>
-                              <w:rPr>
-                                <w:rFonts w:ascii="Montserrat Regular" w:eastAsia="Montserrat Regular" w:hAnsi="Montserrat Regular" w:cs="Montserrat Regular"/>
-                                <w:sz w:val="28"/>
-                                <w:szCs w:val="28"/>
-                              </w:rPr>
-                            </w:pPr>
-                          </w:p>
-                          <w:p>
-                            <w:pPr>
-                              <w:pStyle w:val="Body"/>
-                              <w:rPr>
-                                <w:rFonts w:ascii="Montserrat Regular" w:eastAsia="Montserrat Regular" w:hAnsi="Montserrat Regular" w:cs="Montserrat Regular"/>
-                                <w:sz w:val="28"/>
-                                <w:szCs w:val="28"/>
-                              </w:rPr>
-                            </w:pPr>
-                          </w:p>
-                          <w:p>
-                            <w:pPr>
-                              <w:pStyle w:val="Body"/>
-                              <w:rPr>
-                                <w:rFonts w:ascii="Montserrat Regular" w:eastAsia="Montserrat Regular" w:hAnsi="Montserrat Regular" w:cs="Montserrat Regular"/>
-                                <w:sz w:val="28"/>
-                                <w:szCs w:val="28"/>
-                                <w:lang w:val="pt-PT"/>
-                              </w:rPr>
-                            </w:pPr>
-                            <w:r>
-                              <w:rPr>
-                                <w:rFonts w:ascii="Montserrat Regular" w:hAnsi="Montserrat Regular"/>
-                                <w:sz w:val="28"/>
-                                <w:szCs w:val="28"/>
-                                <w:lang w:val="pt-PT"/>
-                              </w:rPr>
-                              <w:t>Orientador:</w:t>
-                            </w:r>
-                          </w:p>
-                          <w:p>
-                            <w:pPr>
-                              <w:pStyle w:val="Body"/>
-                              <w:rPr>
-                                <w:rFonts w:ascii="Montserrat Regular" w:eastAsia="Montserrat Regular" w:hAnsi="Montserrat Regular" w:cs="Montserrat Regular"/>
-                                <w:sz w:val="28"/>
-                                <w:szCs w:val="28"/>
-                                <w:lang w:val="pt-PT"/>
-                              </w:rPr>
-                            </w:pPr>
-                            <w:r>
-                              <w:rPr>
-                                <w:rFonts w:ascii="Montserrat Regular" w:hAnsi="Montserrat Regular"/>
-                                <w:sz w:val="28"/>
-                                <w:szCs w:val="28"/>
-                                <w:lang w:val="pt-PT"/>
-                              </w:rPr>
-                              <w:t>Dr. Ruben Pereira</w:t>
+                                <w:lang w:val="pt-PT"/>
+                              </w:rPr>
+                              <w:t xml:space="preserve">. Ruben </w:t>
                             </w:r>
                             <w:r>
                               <w:rPr>
                                 <w:rFonts w:ascii="Montserrat Regular" w:hAnsi="Montserrat Regular"/>
+                                <w:color w:val="000000" w:themeColor="text1"/>
+                                <w:sz w:val="28"/>
+                                <w:szCs w:val="28"/>
+                                <w:lang w:val="pt-PT"/>
+                              </w:rPr>
+                              <w:t>Pereira</w:t>
+                            </w:r>
+                            <w:r>
+                              <w:rPr>
+                                <w:rFonts w:ascii="Montserrat Regular" w:hAnsi="Montserrat Regular"/>
+                                <w:color w:val="000000" w:themeColor="text1"/>
                                 <w:sz w:val="28"/>
                                 <w:szCs w:val="28"/>
                                 <w:lang w:val="pt-PT"/>
@@ -395,113 +412,144 @@
                             <w:r>
                               <w:rPr>
                                 <w:rFonts w:ascii="Montserrat Regular" w:hAnsi="Montserrat Regular"/>
-                                <w:color w:val="EE0000"/>
-                                <w:sz w:val="28"/>
-                                <w:szCs w:val="28"/>
-                                <w:lang w:val="pt-PT"/>
-                              </w:rPr>
-                              <w:t>[categoria]</w:t>
+                                <w:color w:val="000000" w:themeColor="text1"/>
+                                <w:sz w:val="28"/>
+                                <w:szCs w:val="28"/>
+                                <w:lang w:val="pt-PT"/>
+                              </w:rPr>
+                              <w:t>Assistant Professor</w:t>
                             </w:r>
                             <w:r>
                               <w:rPr>
                                 <w:rFonts w:ascii="Montserrat Regular" w:hAnsi="Montserrat Regular"/>
-                                <w:color w:val="EE0000"/>
-                                <w:sz w:val="28"/>
-                                <w:szCs w:val="28"/>
-                                <w:lang w:val="pt-PT"/>
-                              </w:rPr>
-                              <w:t xml:space="preserve"> (</w:t>
+                                <w:color w:val="000000" w:themeColor="text1"/>
+                                <w:sz w:val="28"/>
+                                <w:szCs w:val="28"/>
+                                <w:lang w:val="pt-PT"/>
+                              </w:rPr>
+                              <w:t>,</w:t>
                             </w:r>
                             <w:r>
                               <w:rPr>
-                                <w:rFonts w:ascii="Montserrat Regular" w:hAnsi="Montserrat Regular"/>
-                                <w:color w:val="EE0000"/>
-                                <w:sz w:val="28"/>
-                                <w:szCs w:val="28"/>
-                                <w:lang w:val="pt-PT"/>
-                              </w:rPr>
-                              <w:t>Associate Professor</w:t>
-                            </w:r>
-                            <w:r>
-                              <w:rPr>
-                                <w:rFonts w:ascii="Montserrat Regular" w:hAnsi="Montserrat Regular"/>
-                                <w:color w:val="EE0000"/>
-                                <w:sz w:val="28"/>
-                                <w:szCs w:val="28"/>
-                                <w:lang w:val="pt-PT"/>
-                              </w:rPr>
-                              <w:t>/</w:t>
-                            </w:r>
-                            <w:r>
-                              <w:rPr>
+                                <w:rFonts w:ascii="Montserrat Regular" w:eastAsia="Montserrat Regular" w:hAnsi="Montserrat Regular" w:cs="Montserrat Regular"/>
+                                <w:color w:val="000000" w:themeColor="text1"/>
+                                <w:sz w:val="28"/>
+                                <w:szCs w:val="28"/>
                                 <w:lang w:val="pt-PT"/>
                               </w:rPr>
                               <w:t xml:space="preserve"> </w:t>
                             </w:r>
                             <w:r>
                               <w:rPr>
+                                <w:rFonts w:ascii="Montserrat Regular" w:eastAsia="Montserrat Regular" w:hAnsi="Montserrat Regular" w:cs="Montserrat Regular"/>
+                                <w:sz w:val="28"/>
+                                <w:szCs w:val="28"/>
+                                <w:lang w:val="pt-PT"/>
+                              </w:rPr>
+                              <w:t>ISCTE-IUL</w:t>
+                            </w:r>
+                          </w:p>
+                          <w:p>
+                            <w:pPr>
+                              <w:pStyle w:val="Body"/>
+                              <w:rPr>
+                                <w:rFonts w:ascii="Montserrat Regular" w:eastAsia="Montserrat Regular" w:hAnsi="Montserrat Regular" w:cs="Montserrat Regular"/>
+                                <w:sz w:val="28"/>
+                                <w:szCs w:val="28"/>
+                                <w:lang w:val="pt-PT"/>
+                              </w:rPr>
+                            </w:pPr>
+                          </w:p>
+                          <w:p>
+                            <w:pPr>
+                              <w:pStyle w:val="Body"/>
+                              <w:rPr>
+                                <w:rFonts w:ascii="Montserrat Regular" w:eastAsia="Montserrat Regular" w:hAnsi="Montserrat Regular" w:cs="Montserrat Regular"/>
+                                <w:sz w:val="28"/>
+                                <w:szCs w:val="28"/>
+                                <w:lang w:val="pt-PT"/>
+                              </w:rPr>
+                            </w:pPr>
+                          </w:p>
+                          <w:p>
+                            <w:pPr>
+                              <w:pStyle w:val="Body"/>
+                              <w:rPr>
+                                <w:rFonts w:ascii="Montserrat Regular" w:eastAsia="Montserrat Regular" w:hAnsi="Montserrat Regular" w:cs="Montserrat Regular"/>
+                                <w:sz w:val="28"/>
+                                <w:szCs w:val="28"/>
+                                <w:lang w:val="pt-PT"/>
+                              </w:rPr>
+                            </w:pPr>
+                            <w:r>
+                              <w:rPr>
                                 <w:rFonts w:ascii="Montserrat Regular" w:hAnsi="Montserrat Regular"/>
-                                <w:color w:val="EE0000"/>
-                                <w:sz w:val="28"/>
-                                <w:szCs w:val="28"/>
-                                <w:lang w:val="pt-PT"/>
-                              </w:rPr>
-                              <w:t>Assistant Professor</w:t>
+                                <w:sz w:val="28"/>
+                                <w:szCs w:val="28"/>
+                                <w:lang w:val="pt-PT"/>
+                              </w:rPr>
+                              <w:t>Co-</w:t>
                             </w:r>
                             <w:r>
                               <w:rPr>
                                 <w:rFonts w:ascii="Montserrat Regular" w:hAnsi="Montserrat Regular"/>
-                                <w:color w:val="EE0000"/>
-                                <w:sz w:val="28"/>
-                                <w:szCs w:val="28"/>
-                                <w:lang w:val="pt-PT"/>
-                              </w:rPr>
-                              <w:t>/</w:t>
+                                <w:sz w:val="28"/>
+                                <w:szCs w:val="28"/>
+                                <w:lang w:val="pt-PT"/>
+                              </w:rPr>
+                              <w:t>Supervisor:</w:t>
+                            </w:r>
+                          </w:p>
+                          <w:p>
+                            <w:pPr>
+                              <w:pStyle w:val="Body"/>
+                              <w:rPr>
+                                <w:rFonts w:ascii="Montserrat Regular" w:eastAsia="Montserrat Regular" w:hAnsi="Montserrat Regular" w:cs="Montserrat Regular"/>
+                                <w:sz w:val="28"/>
+                                <w:szCs w:val="28"/>
+                                <w:lang w:val="pt-PT"/>
+                              </w:rPr>
+                            </w:pPr>
+                            <w:r>
+                              <w:rPr>
+                                <w:rFonts w:ascii="Montserrat Regular" w:hAnsi="Montserrat Regular"/>
+                                <w:sz w:val="28"/>
+                                <w:szCs w:val="28"/>
+                                <w:lang w:val="pt-PT"/>
+                              </w:rPr>
+                              <w:t>Prof</w:t>
                             </w:r>
                             <w:r>
                               <w:rPr>
                                 <w:rFonts w:ascii="Montserrat Regular" w:hAnsi="Montserrat Regular"/>
-                                <w:color w:val="EE0000"/>
-                                <w:sz w:val="28"/>
-                                <w:szCs w:val="28"/>
-                                <w:lang w:val="pt-PT"/>
-                              </w:rPr>
-                              <w:t>Professora Auxiliar Convidada</w:t>
+                                <w:sz w:val="28"/>
+                                <w:szCs w:val="28"/>
+                                <w:lang w:val="pt-PT"/>
+                              </w:rPr>
+                              <w:t>.</w:t>
                             </w:r>
                             <w:r>
                               <w:rPr>
                                 <w:rFonts w:ascii="Montserrat Regular" w:hAnsi="Montserrat Regular"/>
-                                <w:color w:val="EE0000"/>
-                                <w:sz w:val="28"/>
-                                <w:szCs w:val="28"/>
-                                <w:lang w:val="pt-PT"/>
-                              </w:rPr>
-                              <w:t>/</w:t>
+                                <w:sz w:val="28"/>
+                                <w:szCs w:val="28"/>
+                                <w:lang w:val="pt-PT"/>
+                              </w:rPr>
+                              <w:t xml:space="preserve"> </w:t>
                             </w:r>
                             <w:r>
                               <w:rPr>
                                 <w:rFonts w:ascii="Montserrat Regular" w:hAnsi="Montserrat Regular"/>
-                                <w:color w:val="EE0000"/>
-                                <w:sz w:val="28"/>
-                                <w:szCs w:val="28"/>
-                                <w:lang w:val="pt-PT"/>
-                              </w:rPr>
-                              <w:t>Researcher</w:t>
+                                <w:sz w:val="28"/>
+                                <w:szCs w:val="28"/>
+                                <w:lang w:val="pt-PT"/>
+                              </w:rPr>
+                              <w:t>Ricardo Amaro</w:t>
                             </w:r>
                             <w:r>
                               <w:rPr>
                                 <w:rFonts w:ascii="Montserrat Regular" w:hAnsi="Montserrat Regular"/>
-                                <w:color w:val="EE0000"/>
-                                <w:sz w:val="28"/>
-                                <w:szCs w:val="28"/>
-                                <w:lang w:val="pt-PT"/>
-                              </w:rPr>
-                              <w:t>)</w:t>
-                            </w:r>
-                            <w:r>
-                              <w:rPr>
-                                <w:rFonts w:ascii="Montserrat Regular" w:hAnsi="Montserrat Regular"/>
-                                <w:color w:val="EE0000"/>
+                                <w:color w:val="000000" w:themeColor="text1"/>
                                 <w:sz w:val="28"/>
                                 <w:szCs w:val="28"/>
                                 <w:lang w:val="pt-PT"/>
@@ -560,56 +608,29 @@
                                 <w:lang w:val="pt-PT"/>
                               </w:rPr>
                             </w:pPr>
+                          </w:p>
+                          <w:p>
+                            <w:pPr>
+                              <w:pStyle w:val="Body"/>
+                              <w:rPr>
+                                <w:color w:val="000000" w:themeColor="text1"/>
+                                <w:lang w:val="pt-PT"/>
+                              </w:rPr>
+                            </w:pPr>
                             <w:r>
                               <w:rPr>
                                 <w:rFonts w:ascii="Montserrat Regular" w:hAnsi="Montserrat Regular"/>
-                                <w:sz w:val="28"/>
-                                <w:szCs w:val="28"/>
-                                <w:lang w:val="pt-PT"/>
-                              </w:rPr>
-                              <w:t>Co-Orientador(a):</w:t>
-                            </w:r>
-                          </w:p>
-                          <w:p>
-                            <w:pPr>
-                              <w:pStyle w:val="Body"/>
-                              <w:rPr>
-                                <w:rFonts w:ascii="Montserrat Regular" w:eastAsia="Montserrat Regular" w:hAnsi="Montserrat Regular" w:cs="Montserrat Regular"/>
-                                <w:sz w:val="28"/>
-                                <w:szCs w:val="28"/>
-                                <w:lang w:val="pt-PT"/>
-                              </w:rPr>
-                            </w:pPr>
-                            <w:r>
-                              <w:rPr>
-                                <w:rFonts w:ascii="Montserrat Regular" w:hAnsi="Montserrat Regular"/>
-                                <w:sz w:val="28"/>
-                                <w:szCs w:val="28"/>
-                                <w:lang w:val="pt-PT"/>
-                              </w:rPr>
-                              <w:t>Dr.</w:t>
+                                <w:color w:val="FF644E" w:themeColor="accent5"/>
+                                <w:sz w:val="28"/>
+                                <w:szCs w:val="28"/>
+                                <w:lang w:val="pt-PT"/>
+                              </w:rPr>
+                              <w:t>Setembro</w:t>
                             </w:r>
                             <w:r>
                               <w:rPr>
                                 <w:rFonts w:ascii="Montserrat Regular" w:hAnsi="Montserrat Regular"/>
-                                <w:sz w:val="28"/>
-                                <w:szCs w:val="28"/>
-                                <w:lang w:val="pt-PT"/>
-                              </w:rPr>
-                              <w:t xml:space="preserve"> </w:t>
-                            </w:r>
-                            <w:r>
-                              <w:rPr>
-                                <w:rFonts w:ascii="Montserrat Regular" w:hAnsi="Montserrat Regular"/>
-                                <w:sz w:val="28"/>
-                                <w:szCs w:val="28"/>
-                                <w:lang w:val="pt-PT"/>
-                              </w:rPr>
-                              <w:t>Ricardo Amaro</w:t>
-                            </w:r>
-                            <w:r>
-                              <w:rPr>
-                                <w:rFonts w:ascii="Montserrat Regular" w:hAnsi="Montserrat Regular"/>
+                                <w:color w:val="FF644E" w:themeColor="accent5"/>
                                 <w:sz w:val="28"/>
                                 <w:szCs w:val="28"/>
                                 <w:lang w:val="pt-PT"/>
@@ -619,105 +640,7 @@
                             <w:r>
                               <w:rPr>
                                 <w:rFonts w:ascii="Montserrat Regular" w:hAnsi="Montserrat Regular"/>
-                                <w:color w:val="EE0000"/>
-                                <w:sz w:val="28"/>
-                                <w:szCs w:val="28"/>
-                                <w:lang w:val="pt-PT"/>
-                              </w:rPr>
-                              <w:t>[categoria],</w:t>
-                            </w:r>
-                            <w:r>
-                              <w:rPr>
-                                <w:rFonts w:ascii="Montserrat Regular" w:eastAsia="Montserrat Regular" w:hAnsi="Montserrat Regular" w:cs="Montserrat Regular"/>
-                                <w:color w:val="EE0000"/>
-                                <w:sz w:val="28"/>
-                                <w:szCs w:val="28"/>
-                                <w:lang w:val="pt-PT"/>
-                              </w:rPr>
-                              <w:t xml:space="preserve"> </w:t>
-                            </w:r>
-                            <w:r>
-                              <w:rPr>
-                                <w:rFonts w:ascii="Montserrat Regular" w:eastAsia="Montserrat Regular" w:hAnsi="Montserrat Regular" w:cs="Montserrat Regular"/>
-                                <w:sz w:val="28"/>
-                                <w:szCs w:val="28"/>
-                                <w:lang w:val="pt-PT"/>
-                              </w:rPr>
-                              <w:t>ISCTE-IUL</w:t>
-                            </w:r>
-                          </w:p>
-                          <w:p>
-                            <w:pPr>
-                              <w:pStyle w:val="Body"/>
-                              <w:rPr>
-                                <w:rFonts w:ascii="Montserrat Regular" w:eastAsia="Montserrat Regular" w:hAnsi="Montserrat Regular" w:cs="Montserrat Regular"/>
-                                <w:sz w:val="28"/>
-                                <w:szCs w:val="28"/>
-                                <w:lang w:val="pt-PT"/>
-                              </w:rPr>
-                            </w:pPr>
-                          </w:p>
-                          <w:p>
-                            <w:pPr>
-                              <w:pStyle w:val="Body"/>
-                              <w:rPr>
-                                <w:rFonts w:ascii="Montserrat Regular" w:eastAsia="Montserrat Regular" w:hAnsi="Montserrat Regular" w:cs="Montserrat Regular"/>
-                                <w:sz w:val="28"/>
-                                <w:szCs w:val="28"/>
-                                <w:lang w:val="pt-PT"/>
-                              </w:rPr>
-                            </w:pPr>
-                          </w:p>
-                          <w:p>
-                            <w:pPr>
-                              <w:pStyle w:val="Body"/>
-                              <w:rPr>
-                                <w:rFonts w:ascii="Montserrat Regular" w:eastAsia="Montserrat Regular" w:hAnsi="Montserrat Regular" w:cs="Montserrat Regular"/>
-                                <w:sz w:val="28"/>
-                                <w:szCs w:val="28"/>
-                                <w:lang w:val="pt-PT"/>
-                              </w:rPr>
-                            </w:pPr>
-                          </w:p>
-                          <w:p>
-                            <w:pPr>
-                              <w:pStyle w:val="Body"/>
-                              <w:rPr>
-                                <w:lang w:val="pt-PT"/>
-                              </w:rPr>
-                            </w:pPr>
-                            <w:r>
-                              <w:rPr>
-                                <w:rFonts w:ascii="Montserrat Regular" w:hAnsi="Montserrat Regular"/>
-                                <w:color w:val="EE0000"/>
-                                <w:sz w:val="28"/>
-                                <w:szCs w:val="28"/>
-                                <w:lang w:val="pt-PT"/>
-                              </w:rPr>
-                              <w:t>Junho</w:t>
-                            </w:r>
-                            <w:r>
-                              <w:rPr>
-                                <w:rFonts w:ascii="Montserrat Regular" w:hAnsi="Montserrat Regular"/>
-                                <w:color w:val="EE0000"/>
-                                <w:sz w:val="28"/>
-                                <w:szCs w:val="28"/>
-                                <w:lang w:val="pt-PT"/>
-                              </w:rPr>
-                              <w:t>,</w:t>
-                            </w:r>
-                            <w:r>
-                              <w:rPr>
-                                <w:rFonts w:ascii="Montserrat Regular" w:hAnsi="Montserrat Regular"/>
-                                <w:sz w:val="28"/>
-                                <w:szCs w:val="28"/>
-                                <w:lang w:val="pt-PT"/>
-                              </w:rPr>
-                              <w:t xml:space="preserve"> </w:t>
-                            </w:r>
-                            <w:r>
-                              <w:rPr>
-                                <w:rFonts w:ascii="Montserrat Regular" w:hAnsi="Montserrat Regular"/>
+                                <w:color w:val="000000" w:themeColor="text1"/>
                                 <w:sz w:val="28"/>
                                 <w:szCs w:val="28"/>
                                 <w:lang w:val="pt-PT"/>
@@ -858,6 +781,7 @@
                           <w:rFonts w:ascii="Montserrat Regular" w:hAnsi="Montserrat Regular"/>
                           <w:sz w:val="28"/>
                           <w:szCs w:val="28"/>
+                          <w:lang w:val="pt-PT"/>
                         </w:rPr>
                       </w:pPr>
                       <w:r>
@@ -865,90 +789,106 @@
                           <w:rFonts w:ascii="Montserrat Regular" w:hAnsi="Montserrat Regular"/>
                           <w:sz w:val="28"/>
                           <w:szCs w:val="28"/>
-                        </w:rPr>
-                        <w:t>Master’s degree</w:t>
+                          <w:lang w:val="pt-PT"/>
+                        </w:rPr>
+                        <w:t>Master’s degree in Artificial Intelligence</w:t>
+                      </w:r>
+                    </w:p>
+                    <w:p>
+                      <w:pPr>
+                        <w:pStyle w:val="Body"/>
+                        <w:rPr>
+                          <w:rFonts w:ascii="Montserrat Regular" w:eastAsia="Montserrat Regular" w:hAnsi="Montserrat Regular" w:cs="Montserrat Regular"/>
+                          <w:sz w:val="28"/>
+                          <w:szCs w:val="28"/>
+                          <w:lang w:val="pt-PT"/>
+                        </w:rPr>
+                      </w:pPr>
+                    </w:p>
+                    <w:p>
+                      <w:pPr>
+                        <w:pStyle w:val="Body"/>
+                        <w:rPr>
+                          <w:rFonts w:ascii="Montserrat Regular" w:eastAsia="Montserrat Regular" w:hAnsi="Montserrat Regular" w:cs="Montserrat Regular"/>
+                          <w:sz w:val="28"/>
+                          <w:szCs w:val="28"/>
+                          <w:lang w:val="pt-PT"/>
+                        </w:rPr>
+                      </w:pPr>
+                    </w:p>
+                    <w:p>
+                      <w:pPr>
+                        <w:pStyle w:val="Body"/>
+                        <w:rPr>
+                          <w:rFonts w:ascii="Montserrat Regular" w:eastAsia="Montserrat Regular" w:hAnsi="Montserrat Regular" w:cs="Montserrat Regular"/>
+                          <w:sz w:val="28"/>
+                          <w:szCs w:val="28"/>
+                          <w:lang w:val="pt-PT"/>
+                        </w:rPr>
+                      </w:pPr>
+                    </w:p>
+                    <w:p>
+                      <w:pPr>
+                        <w:pStyle w:val="Body"/>
+                        <w:rPr>
+                          <w:rFonts w:ascii="Montserrat Regular" w:eastAsia="Montserrat Regular" w:hAnsi="Montserrat Regular" w:cs="Montserrat Regular"/>
+                          <w:sz w:val="28"/>
+                          <w:szCs w:val="28"/>
+                          <w:lang w:val="pt-PT"/>
+                        </w:rPr>
+                      </w:pPr>
+                      <w:r>
+                        <w:rPr>
+                          <w:rFonts w:ascii="Montserrat Regular" w:hAnsi="Montserrat Regular"/>
+                          <w:sz w:val="28"/>
+                          <w:szCs w:val="28"/>
+                          <w:lang w:val="pt-PT"/>
+                        </w:rPr>
+                        <w:t>Supervisor:</w:t>
+                      </w:r>
+                    </w:p>
+                    <w:p>
+                      <w:pPr>
+                        <w:pStyle w:val="Body"/>
+                        <w:rPr>
+                          <w:rFonts w:ascii="Montserrat Regular" w:eastAsia="Montserrat Regular" w:hAnsi="Montserrat Regular" w:cs="Montserrat Regular"/>
+                          <w:sz w:val="28"/>
+                          <w:szCs w:val="28"/>
+                          <w:lang w:val="pt-PT"/>
+                        </w:rPr>
+                      </w:pPr>
+                      <w:r>
+                        <w:rPr>
+                          <w:rFonts w:ascii="Montserrat Regular" w:hAnsi="Montserrat Regular"/>
+                          <w:sz w:val="28"/>
+                          <w:szCs w:val="28"/>
+                          <w:lang w:val="pt-PT"/>
+                        </w:rPr>
+                        <w:t>Prof</w:t>
                       </w:r>
                       <w:r>
                         <w:rPr>
                           <w:rFonts w:ascii="Montserrat Regular" w:hAnsi="Montserrat Regular"/>
                           <w:sz w:val="28"/>
                           <w:szCs w:val="28"/>
-                        </w:rPr>
-                        <w:t xml:space="preserve"> in Artificial Intelligence</w:t>
-                      </w:r>
-                    </w:p>
-                    <w:p>
-                      <w:pPr>
-                        <w:pStyle w:val="Body"/>
-                        <w:rPr>
-                          <w:rFonts w:ascii="Montserrat Regular" w:eastAsia="Montserrat Regular" w:hAnsi="Montserrat Regular" w:cs="Montserrat Regular"/>
-                          <w:sz w:val="28"/>
-                          <w:szCs w:val="28"/>
-                        </w:rPr>
-                      </w:pPr>
-                    </w:p>
-                    <w:p>
-                      <w:pPr>
-                        <w:pStyle w:val="Body"/>
-                        <w:rPr>
-                          <w:rFonts w:ascii="Montserrat Regular" w:eastAsia="Montserrat Regular" w:hAnsi="Montserrat Regular" w:cs="Montserrat Regular"/>
-                          <w:sz w:val="28"/>
-                          <w:szCs w:val="28"/>
-                        </w:rPr>
-                      </w:pPr>
-                    </w:p>
-                    <w:p>
-                      <w:pPr>
-                        <w:pStyle w:val="Body"/>
-                        <w:rPr>
-                          <w:rFonts w:ascii="Montserrat Regular" w:eastAsia="Montserrat Regular" w:hAnsi="Montserrat Regular" w:cs="Montserrat Regular"/>
-                          <w:sz w:val="28"/>
-                          <w:szCs w:val="28"/>
-                        </w:rPr>
-                      </w:pPr>
-                    </w:p>
-                    <w:p>
-                      <w:pPr>
-                        <w:pStyle w:val="Body"/>
-                        <w:rPr>
-                          <w:rFonts w:ascii="Montserrat Regular" w:eastAsia="Montserrat Regular" w:hAnsi="Montserrat Regular" w:cs="Montserrat Regular"/>
-                          <w:sz w:val="28"/>
-                          <w:szCs w:val="28"/>
-                          <w:lang w:val="pt-PT"/>
-                        </w:rPr>
-                      </w:pPr>
-                      <w:r>
-                        <w:rPr>
-                          <w:rFonts w:ascii="Montserrat Regular" w:hAnsi="Montserrat Regular"/>
-                          <w:sz w:val="28"/>
-                          <w:szCs w:val="28"/>
-                          <w:lang w:val="pt-PT"/>
-                        </w:rPr>
-                        <w:t>Orientador:</w:t>
-                      </w:r>
-                    </w:p>
-                    <w:p>
-                      <w:pPr>
-                        <w:pStyle w:val="Body"/>
-                        <w:rPr>
-                          <w:rFonts w:ascii="Montserrat Regular" w:eastAsia="Montserrat Regular" w:hAnsi="Montserrat Regular" w:cs="Montserrat Regular"/>
-                          <w:sz w:val="28"/>
-                          <w:szCs w:val="28"/>
-                          <w:lang w:val="pt-PT"/>
-                        </w:rPr>
-                      </w:pPr>
-                      <w:r>
-                        <w:rPr>
-                          <w:rFonts w:ascii="Montserrat Regular" w:hAnsi="Montserrat Regular"/>
-                          <w:sz w:val="28"/>
-                          <w:szCs w:val="28"/>
-                          <w:lang w:val="pt-PT"/>
-                        </w:rPr>
-                        <w:t>Dr. Ruben Pereira</w:t>
+                          <w:lang w:val="pt-PT"/>
+                        </w:rPr>
+                        <w:t xml:space="preserve">. Ruben </w:t>
                       </w:r>
                       <w:r>
                         <w:rPr>
                           <w:rFonts w:ascii="Montserrat Regular" w:hAnsi="Montserrat Regular"/>
+                          <w:color w:val="000000" w:themeColor="text1"/>
+                          <w:sz w:val="28"/>
+                          <w:szCs w:val="28"/>
+                          <w:lang w:val="pt-PT"/>
+                        </w:rPr>
+                        <w:t>Pereira</w:t>
+                      </w:r>
+                      <w:r>
+                        <w:rPr>
+                          <w:rFonts w:ascii="Montserrat Regular" w:hAnsi="Montserrat Regular"/>
+                          <w:color w:val="000000" w:themeColor="text1"/>
                           <w:sz w:val="28"/>
                           <w:szCs w:val="28"/>
                           <w:lang w:val="pt-PT"/>
@@ -958,113 +898,144 @@
                       <w:r>
                         <w:rPr>
                           <w:rFonts w:ascii="Montserrat Regular" w:hAnsi="Montserrat Regular"/>
-                          <w:color w:val="EE0000"/>
-                          <w:sz w:val="28"/>
-                          <w:szCs w:val="28"/>
-                          <w:lang w:val="pt-PT"/>
-                        </w:rPr>
-                        <w:t>[categoria]</w:t>
+                          <w:color w:val="000000" w:themeColor="text1"/>
+                          <w:sz w:val="28"/>
+                          <w:szCs w:val="28"/>
+                          <w:lang w:val="pt-PT"/>
+                        </w:rPr>
+                        <w:t>Assistant Professor</w:t>
                       </w:r>
                       <w:r>
                         <w:rPr>
                           <w:rFonts w:ascii="Montserrat Regular" w:hAnsi="Montserrat Regular"/>
-                          <w:color w:val="EE0000"/>
-                          <w:sz w:val="28"/>
-                          <w:szCs w:val="28"/>
-                          <w:lang w:val="pt-PT"/>
-                        </w:rPr>
-                        <w:t xml:space="preserve"> (</w:t>
+                          <w:color w:val="000000" w:themeColor="text1"/>
+                          <w:sz w:val="28"/>
+                          <w:szCs w:val="28"/>
+                          <w:lang w:val="pt-PT"/>
+                        </w:rPr>
+                        <w:t>,</w:t>
                       </w:r>
                       <w:r>
                         <w:rPr>
-                          <w:rFonts w:ascii="Montserrat Regular" w:hAnsi="Montserrat Regular"/>
-                          <w:color w:val="EE0000"/>
-                          <w:sz w:val="28"/>
-                          <w:szCs w:val="28"/>
-                          <w:lang w:val="pt-PT"/>
-                        </w:rPr>
-                        <w:t>Associate Professor</w:t>
-                      </w:r>
-                      <w:r>
-                        <w:rPr>
-                          <w:rFonts w:ascii="Montserrat Regular" w:hAnsi="Montserrat Regular"/>
-                          <w:color w:val="EE0000"/>
-                          <w:sz w:val="28"/>
-                          <w:szCs w:val="28"/>
-                          <w:lang w:val="pt-PT"/>
-                        </w:rPr>
-                        <w:t>/</w:t>
-                      </w:r>
-                      <w:r>
-                        <w:rPr>
+                          <w:rFonts w:ascii="Montserrat Regular" w:eastAsia="Montserrat Regular" w:hAnsi="Montserrat Regular" w:cs="Montserrat Regular"/>
+                          <w:color w:val="000000" w:themeColor="text1"/>
+                          <w:sz w:val="28"/>
+                          <w:szCs w:val="28"/>
                           <w:lang w:val="pt-PT"/>
                         </w:rPr>
                         <w:t xml:space="preserve"> </w:t>
                       </w:r>
                       <w:r>
                         <w:rPr>
+                          <w:rFonts w:ascii="Montserrat Regular" w:eastAsia="Montserrat Regular" w:hAnsi="Montserrat Regular" w:cs="Montserrat Regular"/>
+                          <w:sz w:val="28"/>
+                          <w:szCs w:val="28"/>
+                          <w:lang w:val="pt-PT"/>
+                        </w:rPr>
+                        <w:t>ISCTE-IUL</w:t>
+                      </w:r>
+                    </w:p>
+                    <w:p>
+                      <w:pPr>
+                        <w:pStyle w:val="Body"/>
+                        <w:rPr>
+                          <w:rFonts w:ascii="Montserrat Regular" w:eastAsia="Montserrat Regular" w:hAnsi="Montserrat Regular" w:cs="Montserrat Regular"/>
+                          <w:sz w:val="28"/>
+                          <w:szCs w:val="28"/>
+                          <w:lang w:val="pt-PT"/>
+                        </w:rPr>
+                      </w:pPr>
+                    </w:p>
+                    <w:p>
+                      <w:pPr>
+                        <w:pStyle w:val="Body"/>
+                        <w:rPr>
+                          <w:rFonts w:ascii="Montserrat Regular" w:eastAsia="Montserrat Regular" w:hAnsi="Montserrat Regular" w:cs="Montserrat Regular"/>
+                          <w:sz w:val="28"/>
+                          <w:szCs w:val="28"/>
+                          <w:lang w:val="pt-PT"/>
+                        </w:rPr>
+                      </w:pPr>
+                    </w:p>
+                    <w:p>
+                      <w:pPr>
+                        <w:pStyle w:val="Body"/>
+                        <w:rPr>
+                          <w:rFonts w:ascii="Montserrat Regular" w:eastAsia="Montserrat Regular" w:hAnsi="Montserrat Regular" w:cs="Montserrat Regular"/>
+                          <w:sz w:val="28"/>
+                          <w:szCs w:val="28"/>
+                          <w:lang w:val="pt-PT"/>
+                        </w:rPr>
+                      </w:pPr>
+                      <w:r>
+                        <w:rPr>
                           <w:rFonts w:ascii="Montserrat Regular" w:hAnsi="Montserrat Regular"/>
-                          <w:color w:val="EE0000"/>
-                          <w:sz w:val="28"/>
-                          <w:szCs w:val="28"/>
-                          <w:lang w:val="pt-PT"/>
-                        </w:rPr>
-                        <w:t>Assistant Professor</w:t>
+                          <w:sz w:val="28"/>
+                          <w:szCs w:val="28"/>
+                          <w:lang w:val="pt-PT"/>
+                        </w:rPr>
+                        <w:t>Co-</w:t>
                       </w:r>
                       <w:r>
                         <w:rPr>
                           <w:rFonts w:ascii="Montserrat Regular" w:hAnsi="Montserrat Regular"/>
-                          <w:color w:val="EE0000"/>
-                          <w:sz w:val="28"/>
-                          <w:szCs w:val="28"/>
-                          <w:lang w:val="pt-PT"/>
-                        </w:rPr>
-                        <w:t>/</w:t>
+                          <w:sz w:val="28"/>
+                          <w:szCs w:val="28"/>
+                          <w:lang w:val="pt-PT"/>
+                        </w:rPr>
+                        <w:t>Supervisor:</w:t>
+                      </w:r>
+                    </w:p>
+                    <w:p>
+                      <w:pPr>
+                        <w:pStyle w:val="Body"/>
+                        <w:rPr>
+                          <w:rFonts w:ascii="Montserrat Regular" w:eastAsia="Montserrat Regular" w:hAnsi="Montserrat Regular" w:cs="Montserrat Regular"/>
+                          <w:sz w:val="28"/>
+                          <w:szCs w:val="28"/>
+                          <w:lang w:val="pt-PT"/>
+                        </w:rPr>
+                      </w:pPr>
+                      <w:r>
+                        <w:rPr>
+                          <w:rFonts w:ascii="Montserrat Regular" w:hAnsi="Montserrat Regular"/>
+                          <w:sz w:val="28"/>
+                          <w:szCs w:val="28"/>
+                          <w:lang w:val="pt-PT"/>
+                        </w:rPr>
+                        <w:t>Prof</w:t>
                       </w:r>
                       <w:r>
                         <w:rPr>
                           <w:rFonts w:ascii="Montserrat Regular" w:hAnsi="Montserrat Regular"/>
-                          <w:color w:val="EE0000"/>
-                          <w:sz w:val="28"/>
-                          <w:szCs w:val="28"/>
-                          <w:lang w:val="pt-PT"/>
-                        </w:rPr>
-                        <w:t>Professora Auxiliar Convidada</w:t>
+                          <w:sz w:val="28"/>
+                          <w:szCs w:val="28"/>
+                          <w:lang w:val="pt-PT"/>
+                        </w:rPr>
+                        <w:t>.</w:t>
                       </w:r>
                       <w:r>
                         <w:rPr>
                           <w:rFonts w:ascii="Montserrat Regular" w:hAnsi="Montserrat Regular"/>
-                          <w:color w:val="EE0000"/>
-                          <w:sz w:val="28"/>
-                          <w:szCs w:val="28"/>
-                          <w:lang w:val="pt-PT"/>
-                        </w:rPr>
-                        <w:t>/</w:t>
+                          <w:sz w:val="28"/>
+                          <w:szCs w:val="28"/>
+                          <w:lang w:val="pt-PT"/>
+                        </w:rPr>
+                        <w:t xml:space="preserve"> </w:t>
                       </w:r>
                       <w:r>
                         <w:rPr>
                           <w:rFonts w:ascii="Montserrat Regular" w:hAnsi="Montserrat Regular"/>
-                          <w:color w:val="EE0000"/>
-                          <w:sz w:val="28"/>
-                          <w:szCs w:val="28"/>
-                          <w:lang w:val="pt-PT"/>
-                        </w:rPr>
-                        <w:t>Researcher</w:t>
+                          <w:sz w:val="28"/>
+                          <w:szCs w:val="28"/>
+                          <w:lang w:val="pt-PT"/>
+                        </w:rPr>
+                        <w:t>Ricardo Amaro</w:t>
                       </w:r>
                       <w:r>
                         <w:rPr>
                           <w:rFonts w:ascii="Montserrat Regular" w:hAnsi="Montserrat Regular"/>
-                          <w:color w:val="EE0000"/>
-                          <w:sz w:val="28"/>
-                          <w:szCs w:val="28"/>
-                          <w:lang w:val="pt-PT"/>
-                        </w:rPr>
-                        <w:t>)</w:t>
-                      </w:r>
-                      <w:r>
-                        <w:rPr>
-                          <w:rFonts w:ascii="Montserrat Regular" w:hAnsi="Montserrat Regular"/>
-                          <w:color w:val="EE0000"/>
+                          <w:color w:val="000000" w:themeColor="text1"/>
                           <w:sz w:val="28"/>
                           <w:szCs w:val="28"/>
                           <w:lang w:val="pt-PT"/>
@@ -1123,56 +1094,29 @@
                           <w:lang w:val="pt-PT"/>
                         </w:rPr>
                       </w:pPr>
+                    </w:p>
+                    <w:p>
+                      <w:pPr>
+                        <w:pStyle w:val="Body"/>
+                        <w:rPr>
+                          <w:color w:val="000000" w:themeColor="text1"/>
+                          <w:lang w:val="pt-PT"/>
+                        </w:rPr>
+                      </w:pPr>
                       <w:r>
                         <w:rPr>
                           <w:rFonts w:ascii="Montserrat Regular" w:hAnsi="Montserrat Regular"/>
-                          <w:sz w:val="28"/>
-                          <w:szCs w:val="28"/>
-                          <w:lang w:val="pt-PT"/>
-                        </w:rPr>
-                        <w:t>Co-Orientador(a):</w:t>
-                      </w:r>
-                    </w:p>
-                    <w:p>
-                      <w:pPr>
-                        <w:pStyle w:val="Body"/>
-                        <w:rPr>
-                          <w:rFonts w:ascii="Montserrat Regular" w:eastAsia="Montserrat Regular" w:hAnsi="Montserrat Regular" w:cs="Montserrat Regular"/>
-                          <w:sz w:val="28"/>
-                          <w:szCs w:val="28"/>
-                          <w:lang w:val="pt-PT"/>
-                        </w:rPr>
-                      </w:pPr>
-                      <w:r>
-                        <w:rPr>
-                          <w:rFonts w:ascii="Montserrat Regular" w:hAnsi="Montserrat Regular"/>
-                          <w:sz w:val="28"/>
-                          <w:szCs w:val="28"/>
-                          <w:lang w:val="pt-PT"/>
-                        </w:rPr>
-                        <w:t>Dr.</w:t>
+                          <w:color w:val="FF644E" w:themeColor="accent5"/>
+                          <w:sz w:val="28"/>
+                          <w:szCs w:val="28"/>
+                          <w:lang w:val="pt-PT"/>
+                        </w:rPr>
+                        <w:t>Setembro</w:t>
                       </w:r>
                       <w:r>
                         <w:rPr>
                           <w:rFonts w:ascii="Montserrat Regular" w:hAnsi="Montserrat Regular"/>
-                          <w:sz w:val="28"/>
-                          <w:szCs w:val="28"/>
-                          <w:lang w:val="pt-PT"/>
-                        </w:rPr>
-                        <w:t xml:space="preserve"> </w:t>
-                      </w:r>
-                      <w:r>
-                        <w:rPr>
-                          <w:rFonts w:ascii="Montserrat Regular" w:hAnsi="Montserrat Regular"/>
-                          <w:sz w:val="28"/>
-                          <w:szCs w:val="28"/>
-                          <w:lang w:val="pt-PT"/>
-                        </w:rPr>
-                        <w:t>Ricardo Amaro</w:t>
-                      </w:r>
-                      <w:r>
-                        <w:rPr>
-                          <w:rFonts w:ascii="Montserrat Regular" w:hAnsi="Montserrat Regular"/>
+                          <w:color w:val="FF644E" w:themeColor="accent5"/>
                           <w:sz w:val="28"/>
                           <w:szCs w:val="28"/>
                           <w:lang w:val="pt-PT"/>
@@ -1182,105 +1126,7 @@
                       <w:r>
                         <w:rPr>
                           <w:rFonts w:ascii="Montserrat Regular" w:hAnsi="Montserrat Regular"/>
-                          <w:color w:val="EE0000"/>
-                          <w:sz w:val="28"/>
-                          <w:szCs w:val="28"/>
-                          <w:lang w:val="pt-PT"/>
-                        </w:rPr>
-                        <w:t>[categoria],</w:t>
-                      </w:r>
-                      <w:r>
-                        <w:rPr>
-                          <w:rFonts w:ascii="Montserrat Regular" w:eastAsia="Montserrat Regular" w:hAnsi="Montserrat Regular" w:cs="Montserrat Regular"/>
-                          <w:color w:val="EE0000"/>
-                          <w:sz w:val="28"/>
-                          <w:szCs w:val="28"/>
-                          <w:lang w:val="pt-PT"/>
-                        </w:rPr>
-                        <w:t xml:space="preserve"> </w:t>
-                      </w:r>
-                      <w:r>
-                        <w:rPr>
-                          <w:rFonts w:ascii="Montserrat Regular" w:eastAsia="Montserrat Regular" w:hAnsi="Montserrat Regular" w:cs="Montserrat Regular"/>
-                          <w:sz w:val="28"/>
-                          <w:szCs w:val="28"/>
-                          <w:lang w:val="pt-PT"/>
-                        </w:rPr>
-                        <w:t>ISCTE-IUL</w:t>
-                      </w:r>
-                    </w:p>
-                    <w:p>
-                      <w:pPr>
-                        <w:pStyle w:val="Body"/>
-                        <w:rPr>
-                          <w:rFonts w:ascii="Montserrat Regular" w:eastAsia="Montserrat Regular" w:hAnsi="Montserrat Regular" w:cs="Montserrat Regular"/>
-                          <w:sz w:val="28"/>
-                          <w:szCs w:val="28"/>
-                          <w:lang w:val="pt-PT"/>
-                        </w:rPr>
-                      </w:pPr>
-                    </w:p>
-                    <w:p>
-                      <w:pPr>
-                        <w:pStyle w:val="Body"/>
-                        <w:rPr>
-                          <w:rFonts w:ascii="Montserrat Regular" w:eastAsia="Montserrat Regular" w:hAnsi="Montserrat Regular" w:cs="Montserrat Regular"/>
-                          <w:sz w:val="28"/>
-                          <w:szCs w:val="28"/>
-                          <w:lang w:val="pt-PT"/>
-                        </w:rPr>
-                      </w:pPr>
-                    </w:p>
-                    <w:p>
-                      <w:pPr>
-                        <w:pStyle w:val="Body"/>
-                        <w:rPr>
-                          <w:rFonts w:ascii="Montserrat Regular" w:eastAsia="Montserrat Regular" w:hAnsi="Montserrat Regular" w:cs="Montserrat Regular"/>
-                          <w:sz w:val="28"/>
-                          <w:szCs w:val="28"/>
-                          <w:lang w:val="pt-PT"/>
-                        </w:rPr>
-                      </w:pPr>
-                    </w:p>
-                    <w:p>
-                      <w:pPr>
-                        <w:pStyle w:val="Body"/>
-                        <w:rPr>
-                          <w:lang w:val="pt-PT"/>
-                        </w:rPr>
-                      </w:pPr>
-                      <w:r>
-                        <w:rPr>
-                          <w:rFonts w:ascii="Montserrat Regular" w:hAnsi="Montserrat Regular"/>
-                          <w:color w:val="EE0000"/>
-                          <w:sz w:val="28"/>
-                          <w:szCs w:val="28"/>
-                          <w:lang w:val="pt-PT"/>
-                        </w:rPr>
-                        <w:t>Junho</w:t>
-                      </w:r>
-                      <w:r>
-                        <w:rPr>
-                          <w:rFonts w:ascii="Montserrat Regular" w:hAnsi="Montserrat Regular"/>
-                          <w:color w:val="EE0000"/>
-                          <w:sz w:val="28"/>
-                          <w:szCs w:val="28"/>
-                          <w:lang w:val="pt-PT"/>
-                        </w:rPr>
-                        <w:t>,</w:t>
-                      </w:r>
-                      <w:r>
-                        <w:rPr>
-                          <w:rFonts w:ascii="Montserrat Regular" w:hAnsi="Montserrat Regular"/>
-                          <w:sz w:val="28"/>
-                          <w:szCs w:val="28"/>
-                          <w:lang w:val="pt-PT"/>
-                        </w:rPr>
-                        <w:t xml:space="preserve"> </w:t>
-                      </w:r>
-                      <w:r>
-                        <w:rPr>
-                          <w:rFonts w:ascii="Montserrat Regular" w:hAnsi="Montserrat Regular"/>
+                          <w:color w:val="000000" w:themeColor="text1"/>
                           <w:sz w:val="28"/>
                           <w:szCs w:val="28"/>
                           <w:lang w:val="pt-PT"/>
@@ -1719,7 +1565,7 @@
                                 <w:szCs w:val="28"/>
                                 <w:lang w:val="pt-PT"/>
                               </w:rPr>
-                              <w:t>Orientador:</w:t>
+                              <w:t>Supervisor:</w:t>
                             </w:r>
                           </w:p>
                           <w:p>
@@ -1739,118 +1585,112 @@
                                 <w:szCs w:val="28"/>
                                 <w:lang w:val="pt-PT"/>
                               </w:rPr>
-                              <w:t xml:space="preserve">Dr. Ruben Pereira, </w:t>
+                              <w:t xml:space="preserve">Prof. Ruben </w:t>
                             </w:r>
                             <w:r>
                               <w:rPr>
                                 <w:rFonts w:ascii="Montserrat Regular" w:hAnsi="Montserrat Regular"/>
-                                <w:color w:val="EE0000"/>
-                                <w:sz w:val="28"/>
-                                <w:szCs w:val="28"/>
-                                <w:lang w:val="pt-PT"/>
-                              </w:rPr>
-                              <w:t>[categoria]</w:t>
+                                <w:color w:val="000000" w:themeColor="text1"/>
+                                <w:sz w:val="28"/>
+                                <w:szCs w:val="28"/>
+                                <w:lang w:val="pt-PT"/>
+                              </w:rPr>
+                              <w:t>Pereira, Assistant Professor,</w:t>
                             </w:r>
                             <w:r>
                               <w:rPr>
-                                <w:rFonts w:ascii="Montserrat Regular" w:hAnsi="Montserrat Regular"/>
-                                <w:color w:val="EE0000"/>
-                                <w:sz w:val="28"/>
-                                <w:szCs w:val="28"/>
-                                <w:lang w:val="pt-PT"/>
-                              </w:rPr>
-                              <w:t xml:space="preserve"> (</w:t>
-                            </w:r>
-                            <w:r>
-                              <w:rPr>
-                                <w:rFonts w:ascii="Montserrat Regular" w:hAnsi="Montserrat Regular"/>
-                                <w:color w:val="EE0000"/>
-                                <w:sz w:val="28"/>
-                                <w:szCs w:val="28"/>
-                                <w:lang w:val="pt-PT"/>
-                              </w:rPr>
-                              <w:t>Associate Professor</w:t>
-                            </w:r>
-                            <w:r>
-                              <w:rPr>
-                                <w:rFonts w:ascii="Montserrat Regular" w:hAnsi="Montserrat Regular"/>
-                                <w:color w:val="EE0000"/>
-                                <w:sz w:val="28"/>
-                                <w:szCs w:val="28"/>
-                                <w:lang w:val="pt-PT"/>
-                              </w:rPr>
-                              <w:t>/</w:t>
-                            </w:r>
-                            <w:r>
-                              <w:rPr>
+                                <w:rFonts w:ascii="Montserrat Regular" w:eastAsia="Montserrat Regular" w:hAnsi="Montserrat Regular" w:cs="Montserrat Regular"/>
+                                <w:color w:val="000000" w:themeColor="text1"/>
+                                <w:sz w:val="28"/>
+                                <w:szCs w:val="28"/>
                                 <w:lang w:val="pt-PT"/>
                               </w:rPr>
                               <w:t xml:space="preserve"> </w:t>
                             </w:r>
                             <w:r>
                               <w:rPr>
+                                <w:rFonts w:ascii="Montserrat Regular" w:eastAsia="Montserrat Regular" w:hAnsi="Montserrat Regular" w:cs="Montserrat Regular"/>
+                                <w:sz w:val="28"/>
+                                <w:szCs w:val="28"/>
+                                <w:lang w:val="pt-PT"/>
+                              </w:rPr>
+                              <w:t>ISCTE-IUL</w:t>
+                            </w:r>
+                          </w:p>
+                          <w:p>
+                            <w:pPr>
+                              <w:pStyle w:val="Body"/>
+                              <w:rPr>
+                                <w:rFonts w:ascii="Montserrat Regular" w:eastAsia="Montserrat Regular" w:hAnsi="Montserrat Regular" w:cs="Montserrat Regular"/>
+                                <w:sz w:val="28"/>
+                                <w:szCs w:val="28"/>
+                                <w:lang w:val="pt-PT"/>
+                              </w:rPr>
+                            </w:pPr>
+                          </w:p>
+                          <w:p>
+                            <w:pPr>
+                              <w:pStyle w:val="Body"/>
+                              <w:rPr>
+                                <w:rFonts w:ascii="Montserrat Regular" w:eastAsia="Montserrat Regular" w:hAnsi="Montserrat Regular" w:cs="Montserrat Regular"/>
+                                <w:sz w:val="28"/>
+                                <w:szCs w:val="28"/>
+                                <w:lang w:val="pt-PT"/>
+                              </w:rPr>
+                            </w:pPr>
+                          </w:p>
+                          <w:p>
+                            <w:pPr>
+                              <w:pStyle w:val="Body"/>
+                              <w:rPr>
+                                <w:rFonts w:ascii="Montserrat Regular" w:eastAsia="Montserrat Regular" w:hAnsi="Montserrat Regular" w:cs="Montserrat Regular"/>
+                                <w:sz w:val="28"/>
+                                <w:szCs w:val="28"/>
+                                <w:lang w:val="pt-PT"/>
+                              </w:rPr>
+                            </w:pPr>
+                            <w:r>
+                              <w:rPr>
                                 <w:rFonts w:ascii="Montserrat Regular" w:hAnsi="Montserrat Regular"/>
-                                <w:color w:val="EE0000"/>
-                                <w:sz w:val="28"/>
-                                <w:szCs w:val="28"/>
-                                <w:lang w:val="pt-PT"/>
-                              </w:rPr>
-                              <w:t>Assistant Professor</w:t>
+                                <w:sz w:val="28"/>
+                                <w:szCs w:val="28"/>
+                                <w:lang w:val="pt-PT"/>
+                              </w:rPr>
+                              <w:t>Co-</w:t>
                             </w:r>
                             <w:r>
                               <w:rPr>
                                 <w:rFonts w:ascii="Montserrat Regular" w:hAnsi="Montserrat Regular"/>
-                                <w:color w:val="EE0000"/>
-                                <w:sz w:val="28"/>
-                                <w:szCs w:val="28"/>
-                                <w:lang w:val="pt-PT"/>
-                              </w:rPr>
-                              <w:t>/</w:t>
+                                <w:sz w:val="28"/>
+                                <w:szCs w:val="28"/>
+                                <w:lang w:val="pt-PT"/>
+                              </w:rPr>
+                              <w:t>Supervisor:</w:t>
+                            </w:r>
+                          </w:p>
+                          <w:p>
+                            <w:pPr>
+                              <w:pStyle w:val="Body"/>
+                              <w:rPr>
+                                <w:rFonts w:ascii="Montserrat Regular" w:eastAsia="Montserrat Regular" w:hAnsi="Montserrat Regular" w:cs="Montserrat Regular"/>
+                                <w:sz w:val="28"/>
+                                <w:szCs w:val="28"/>
+                                <w:lang w:val="pt-PT"/>
+                              </w:rPr>
+                            </w:pPr>
+                            <w:r>
+                              <w:rPr>
+                                <w:rFonts w:ascii="Montserrat Regular" w:hAnsi="Montserrat Regular"/>
+                                <w:sz w:val="28"/>
+                                <w:szCs w:val="28"/>
+                                <w:lang w:val="pt-PT"/>
+                              </w:rPr>
+                              <w:t>Prof. Ricardo Amaro</w:t>
                             </w:r>
                             <w:r>
                               <w:rPr>
                                 <w:rFonts w:ascii="Montserrat Regular" w:hAnsi="Montserrat Regular"/>
-                                <w:color w:val="EE0000"/>
-                                <w:sz w:val="28"/>
-                                <w:szCs w:val="28"/>
-                                <w:lang w:val="pt-PT"/>
-                              </w:rPr>
-                              <w:t>Professora Auxiliar Convidada</w:t>
-                            </w:r>
-                            <w:r>
-                              <w:rPr>
-                                <w:rFonts w:ascii="Montserrat Regular" w:hAnsi="Montserrat Regular"/>
-                                <w:color w:val="EE0000"/>
-                                <w:sz w:val="28"/>
-                                <w:szCs w:val="28"/>
-                                <w:lang w:val="pt-PT"/>
-                              </w:rPr>
-                              <w:t>/</w:t>
-                            </w:r>
-                            <w:r>
-                              <w:rPr>
-                                <w:rFonts w:ascii="Montserrat Regular" w:hAnsi="Montserrat Regular"/>
-                                <w:color w:val="EE0000"/>
-                                <w:sz w:val="28"/>
-                                <w:szCs w:val="28"/>
-                                <w:lang w:val="pt-PT"/>
-                              </w:rPr>
-                              <w:t>Researcher</w:t>
-                            </w:r>
-                            <w:r>
-                              <w:rPr>
-                                <w:rFonts w:ascii="Montserrat Regular" w:hAnsi="Montserrat Regular"/>
-                                <w:color w:val="EE0000"/>
-                                <w:sz w:val="28"/>
-                                <w:szCs w:val="28"/>
-                                <w:lang w:val="pt-PT"/>
-                              </w:rPr>
-                              <w:t>)</w:t>
-                            </w:r>
-                            <w:r>
-                              <w:rPr>
-                                <w:rFonts w:ascii="Montserrat Regular" w:hAnsi="Montserrat Regular"/>
-                                <w:color w:val="EE0000"/>
+                                <w:color w:val="000000" w:themeColor="text1"/>
                                 <w:sz w:val="28"/>
                                 <w:szCs w:val="28"/>
                                 <w:lang w:val="pt-PT"/>
@@ -1909,34 +1749,23 @@
                                 <w:lang w:val="pt-PT"/>
                               </w:rPr>
                             </w:pPr>
+                          </w:p>
+                          <w:p>
+                            <w:pPr>
+                              <w:pStyle w:val="Body"/>
+                              <w:rPr>
+                                <w:lang w:val="pt-PT"/>
+                              </w:rPr>
+                            </w:pPr>
                             <w:r>
                               <w:rPr>
                                 <w:rFonts w:ascii="Montserrat Regular" w:hAnsi="Montserrat Regular"/>
-                                <w:sz w:val="28"/>
-                                <w:szCs w:val="28"/>
-                                <w:lang w:val="pt-PT"/>
-                              </w:rPr>
-                              <w:t>Co-Orientador(a):</w:t>
-                            </w:r>
-                          </w:p>
-                          <w:p>
-                            <w:pPr>
-                              <w:pStyle w:val="Body"/>
-                              <w:rPr>
-                                <w:rFonts w:ascii="Montserrat Regular" w:eastAsia="Montserrat Regular" w:hAnsi="Montserrat Regular" w:cs="Montserrat Regular"/>
-                                <w:sz w:val="28"/>
-                                <w:szCs w:val="28"/>
-                                <w:lang w:val="pt-PT"/>
-                              </w:rPr>
-                            </w:pPr>
-                            <w:r>
-                              <w:rPr>
-                                <w:rFonts w:ascii="Montserrat Regular" w:hAnsi="Montserrat Regular"/>
-                                <w:sz w:val="28"/>
-                                <w:szCs w:val="28"/>
-                                <w:lang w:val="pt-PT"/>
-                              </w:rPr>
-                              <w:t xml:space="preserve">Dr. Ricardo Amaro, </w:t>
+                                <w:color w:val="EE0000"/>
+                                <w:sz w:val="28"/>
+                                <w:szCs w:val="28"/>
+                                <w:lang w:val="pt-PT"/>
+                              </w:rPr>
+                              <w:t>Setembro</w:t>
                             </w:r>
                             <w:r>
                               <w:rPr>
@@ -1946,77 +1775,7 @@
                                 <w:szCs w:val="28"/>
                                 <w:lang w:val="pt-PT"/>
                               </w:rPr>
-                              <w:t>[categoria],</w:t>
-                            </w:r>
-                            <w:r>
-                              <w:rPr>
-                                <w:rFonts w:ascii="Montserrat Regular" w:eastAsia="Montserrat Regular" w:hAnsi="Montserrat Regular" w:cs="Montserrat Regular"/>
-                                <w:color w:val="EE0000"/>
-                                <w:sz w:val="28"/>
-                                <w:szCs w:val="28"/>
-                                <w:lang w:val="pt-PT"/>
-                              </w:rPr>
-                              <w:t xml:space="preserve"> </w:t>
-                            </w:r>
-                            <w:r>
-                              <w:rPr>
-                                <w:rFonts w:ascii="Montserrat Regular" w:eastAsia="Montserrat Regular" w:hAnsi="Montserrat Regular" w:cs="Montserrat Regular"/>
-                                <w:sz w:val="28"/>
-                                <w:szCs w:val="28"/>
-                                <w:lang w:val="pt-PT"/>
-                              </w:rPr>
-                              <w:t>ISCTE-IUL</w:t>
-                            </w:r>
-                          </w:p>
-                          <w:p>
-                            <w:pPr>
-                              <w:pStyle w:val="Body"/>
-                              <w:rPr>
-                                <w:rFonts w:ascii="Montserrat Regular" w:eastAsia="Montserrat Regular" w:hAnsi="Montserrat Regular" w:cs="Montserrat Regular"/>
-                                <w:sz w:val="28"/>
-                                <w:szCs w:val="28"/>
-                                <w:lang w:val="pt-PT"/>
-                              </w:rPr>
-                            </w:pPr>
-                          </w:p>
-                          <w:p>
-                            <w:pPr>
-                              <w:pStyle w:val="Body"/>
-                              <w:rPr>
-                                <w:rFonts w:ascii="Montserrat Regular" w:eastAsia="Montserrat Regular" w:hAnsi="Montserrat Regular" w:cs="Montserrat Regular"/>
-                                <w:sz w:val="28"/>
-                                <w:szCs w:val="28"/>
-                                <w:lang w:val="pt-PT"/>
-                              </w:rPr>
-                            </w:pPr>
-                          </w:p>
-                          <w:p>
-                            <w:pPr>
-                              <w:pStyle w:val="Body"/>
-                              <w:rPr>
-                                <w:rFonts w:ascii="Montserrat Regular" w:eastAsia="Montserrat Regular" w:hAnsi="Montserrat Regular" w:cs="Montserrat Regular"/>
-                                <w:sz w:val="28"/>
-                                <w:szCs w:val="28"/>
-                                <w:lang w:val="pt-PT"/>
-                              </w:rPr>
-                            </w:pPr>
-                          </w:p>
-                          <w:p>
-                            <w:pPr>
-                              <w:pStyle w:val="Body"/>
-                              <w:rPr>
-                                <w:lang w:val="pt-PT"/>
-                              </w:rPr>
-                            </w:pPr>
-                            <w:r>
-                              <w:rPr>
-                                <w:rFonts w:ascii="Montserrat Regular" w:hAnsi="Montserrat Regular"/>
-                                <w:color w:val="EE0000"/>
-                                <w:sz w:val="28"/>
-                                <w:szCs w:val="28"/>
-                                <w:lang w:val="pt-PT"/>
-                              </w:rPr>
-                              <w:t>Junho,</w:t>
+                              <w:t>,</w:t>
                             </w:r>
                             <w:r>
                               <w:rPr>
@@ -2297,7 +2056,7 @@
                           <w:szCs w:val="28"/>
                           <w:lang w:val="pt-PT"/>
                         </w:rPr>
-                        <w:t>Orientador:</w:t>
+                        <w:t>Supervisor:</w:t>
                       </w:r>
                     </w:p>
                     <w:p>
@@ -2317,118 +2076,112 @@
                           <w:szCs w:val="28"/>
                           <w:lang w:val="pt-PT"/>
                         </w:rPr>
-                        <w:t xml:space="preserve">Dr. Ruben Pereira, </w:t>
+                        <w:t xml:space="preserve">Prof. Ruben </w:t>
                       </w:r>
                       <w:r>
                         <w:rPr>
                           <w:rFonts w:ascii="Montserrat Regular" w:hAnsi="Montserrat Regular"/>
-                          <w:color w:val="EE0000"/>
-                          <w:sz w:val="28"/>
-                          <w:szCs w:val="28"/>
-                          <w:lang w:val="pt-PT"/>
-                        </w:rPr>
-                        <w:t>[categoria]</w:t>
+                          <w:color w:val="000000" w:themeColor="text1"/>
+                          <w:sz w:val="28"/>
+                          <w:szCs w:val="28"/>
+                          <w:lang w:val="pt-PT"/>
+                        </w:rPr>
+                        <w:t>Pereira, Assistant Professor,</w:t>
                       </w:r>
                       <w:r>
                         <w:rPr>
-                          <w:rFonts w:ascii="Montserrat Regular" w:hAnsi="Montserrat Regular"/>
-                          <w:color w:val="EE0000"/>
-                          <w:sz w:val="28"/>
-                          <w:szCs w:val="28"/>
-                          <w:lang w:val="pt-PT"/>
-                        </w:rPr>
-                        <w:t xml:space="preserve"> (</w:t>
-                      </w:r>
-                      <w:r>
-                        <w:rPr>
-                          <w:rFonts w:ascii="Montserrat Regular" w:hAnsi="Montserrat Regular"/>
-                          <w:color w:val="EE0000"/>
-                          <w:sz w:val="28"/>
-                          <w:szCs w:val="28"/>
-                          <w:lang w:val="pt-PT"/>
-                        </w:rPr>
-                        <w:t>Associate Professor</w:t>
-                      </w:r>
-                      <w:r>
-                        <w:rPr>
-                          <w:rFonts w:ascii="Montserrat Regular" w:hAnsi="Montserrat Regular"/>
-                          <w:color w:val="EE0000"/>
-                          <w:sz w:val="28"/>
-                          <w:szCs w:val="28"/>
-                          <w:lang w:val="pt-PT"/>
-                        </w:rPr>
-                        <w:t>/</w:t>
-                      </w:r>
-                      <w:r>
-                        <w:rPr>
+                          <w:rFonts w:ascii="Montserrat Regular" w:eastAsia="Montserrat Regular" w:hAnsi="Montserrat Regular" w:cs="Montserrat Regular"/>
+                          <w:color w:val="000000" w:themeColor="text1"/>
+                          <w:sz w:val="28"/>
+                          <w:szCs w:val="28"/>
                           <w:lang w:val="pt-PT"/>
                         </w:rPr>
                         <w:t xml:space="preserve"> </w:t>
                       </w:r>
                       <w:r>
                         <w:rPr>
+                          <w:rFonts w:ascii="Montserrat Regular" w:eastAsia="Montserrat Regular" w:hAnsi="Montserrat Regular" w:cs="Montserrat Regular"/>
+                          <w:sz w:val="28"/>
+                          <w:szCs w:val="28"/>
+                          <w:lang w:val="pt-PT"/>
+                        </w:rPr>
+                        <w:t>ISCTE-IUL</w:t>
+                      </w:r>
+                    </w:p>
+                    <w:p>
+                      <w:pPr>
+                        <w:pStyle w:val="Body"/>
+                        <w:rPr>
+                          <w:rFonts w:ascii="Montserrat Regular" w:eastAsia="Montserrat Regular" w:hAnsi="Montserrat Regular" w:cs="Montserrat Regular"/>
+                          <w:sz w:val="28"/>
+                          <w:szCs w:val="28"/>
+                          <w:lang w:val="pt-PT"/>
+                        </w:rPr>
+                      </w:pPr>
+                    </w:p>
+                    <w:p>
+                      <w:pPr>
+                        <w:pStyle w:val="Body"/>
+                        <w:rPr>
+                          <w:rFonts w:ascii="Montserrat Regular" w:eastAsia="Montserrat Regular" w:hAnsi="Montserrat Regular" w:cs="Montserrat Regular"/>
+                          <w:sz w:val="28"/>
+                          <w:szCs w:val="28"/>
+                          <w:lang w:val="pt-PT"/>
+                        </w:rPr>
+                      </w:pPr>
+                    </w:p>
+                    <w:p>
+                      <w:pPr>
+                        <w:pStyle w:val="Body"/>
+                        <w:rPr>
+                          <w:rFonts w:ascii="Montserrat Regular" w:eastAsia="Montserrat Regular" w:hAnsi="Montserrat Regular" w:cs="Montserrat Regular"/>
+                          <w:sz w:val="28"/>
+                          <w:szCs w:val="28"/>
+                          <w:lang w:val="pt-PT"/>
+                        </w:rPr>
+                      </w:pPr>
+                      <w:r>
+                        <w:rPr>
                           <w:rFonts w:ascii="Montserrat Regular" w:hAnsi="Montserrat Regular"/>
-                          <w:color w:val="EE0000"/>
-                          <w:sz w:val="28"/>
-                          <w:szCs w:val="28"/>
-                          <w:lang w:val="pt-PT"/>
-                        </w:rPr>
-                        <w:t>Assistant Professor</w:t>
+                          <w:sz w:val="28"/>
+                          <w:szCs w:val="28"/>
+                          <w:lang w:val="pt-PT"/>
+                        </w:rPr>
+                        <w:t>Co-</w:t>
                       </w:r>
                       <w:r>
                         <w:rPr>
                           <w:rFonts w:ascii="Montserrat Regular" w:hAnsi="Montserrat Regular"/>
-                          <w:color w:val="EE0000"/>
-                          <w:sz w:val="28"/>
-                          <w:szCs w:val="28"/>
-                          <w:lang w:val="pt-PT"/>
-                        </w:rPr>
-                        <w:t>/</w:t>
+                          <w:sz w:val="28"/>
+                          <w:szCs w:val="28"/>
+                          <w:lang w:val="pt-PT"/>
+                        </w:rPr>
+                        <w:t>Supervisor:</w:t>
+                      </w:r>
+                    </w:p>
+                    <w:p>
+                      <w:pPr>
+                        <w:pStyle w:val="Body"/>
+                        <w:rPr>
+                          <w:rFonts w:ascii="Montserrat Regular" w:eastAsia="Montserrat Regular" w:hAnsi="Montserrat Regular" w:cs="Montserrat Regular"/>
+                          <w:sz w:val="28"/>
+                          <w:szCs w:val="28"/>
+                          <w:lang w:val="pt-PT"/>
+                        </w:rPr>
+                      </w:pPr>
+                      <w:r>
+                        <w:rPr>
+                          <w:rFonts w:ascii="Montserrat Regular" w:hAnsi="Montserrat Regular"/>
+                          <w:sz w:val="28"/>
+                          <w:szCs w:val="28"/>
+                          <w:lang w:val="pt-PT"/>
+                        </w:rPr>
+                        <w:t>Prof. Ricardo Amaro</w:t>
                       </w:r>
                       <w:r>
                         <w:rPr>
                           <w:rFonts w:ascii="Montserrat Regular" w:hAnsi="Montserrat Regular"/>
-                          <w:color w:val="EE0000"/>
-                          <w:sz w:val="28"/>
-                          <w:szCs w:val="28"/>
-                          <w:lang w:val="pt-PT"/>
-                        </w:rPr>
-                        <w:t>Professora Auxiliar Convidada</w:t>
-                      </w:r>
-                      <w:r>
-                        <w:rPr>
-                          <w:rFonts w:ascii="Montserrat Regular" w:hAnsi="Montserrat Regular"/>
-                          <w:color w:val="EE0000"/>
-                          <w:sz w:val="28"/>
-                          <w:szCs w:val="28"/>
-                          <w:lang w:val="pt-PT"/>
-                        </w:rPr>
-                        <w:t>/</w:t>
-                      </w:r>
-                      <w:r>
-                        <w:rPr>
-                          <w:rFonts w:ascii="Montserrat Regular" w:hAnsi="Montserrat Regular"/>
-                          <w:color w:val="EE0000"/>
-                          <w:sz w:val="28"/>
-                          <w:szCs w:val="28"/>
-                          <w:lang w:val="pt-PT"/>
-                        </w:rPr>
-                        <w:t>Researcher</w:t>
-                      </w:r>
-                      <w:r>
-                        <w:rPr>
-                          <w:rFonts w:ascii="Montserrat Regular" w:hAnsi="Montserrat Regular"/>
-                          <w:color w:val="EE0000"/>
-                          <w:sz w:val="28"/>
-                          <w:szCs w:val="28"/>
-                          <w:lang w:val="pt-PT"/>
-                        </w:rPr>
-                        <w:t>)</w:t>
-                      </w:r>
-                      <w:r>
-                        <w:rPr>
-                          <w:rFonts w:ascii="Montserrat Regular" w:hAnsi="Montserrat Regular"/>
-                          <w:color w:val="EE0000"/>
+                          <w:color w:val="000000" w:themeColor="text1"/>
                           <w:sz w:val="28"/>
                           <w:szCs w:val="28"/>
                           <w:lang w:val="pt-PT"/>
@@ -2487,34 +2240,23 @@
                           <w:lang w:val="pt-PT"/>
                         </w:rPr>
                       </w:pPr>
+                    </w:p>
+                    <w:p>
+                      <w:pPr>
+                        <w:pStyle w:val="Body"/>
+                        <w:rPr>
+                          <w:lang w:val="pt-PT"/>
+                        </w:rPr>
+                      </w:pPr>
                       <w:r>
                         <w:rPr>
                           <w:rFonts w:ascii="Montserrat Regular" w:hAnsi="Montserrat Regular"/>
-                          <w:sz w:val="28"/>
-                          <w:szCs w:val="28"/>
-                          <w:lang w:val="pt-PT"/>
-                        </w:rPr>
-                        <w:t>Co-Orientador(a):</w:t>
-                      </w:r>
-                    </w:p>
-                    <w:p>
-                      <w:pPr>
-                        <w:pStyle w:val="Body"/>
-                        <w:rPr>
-                          <w:rFonts w:ascii="Montserrat Regular" w:eastAsia="Montserrat Regular" w:hAnsi="Montserrat Regular" w:cs="Montserrat Regular"/>
-                          <w:sz w:val="28"/>
-                          <w:szCs w:val="28"/>
-                          <w:lang w:val="pt-PT"/>
-                        </w:rPr>
-                      </w:pPr>
-                      <w:r>
-                        <w:rPr>
-                          <w:rFonts w:ascii="Montserrat Regular" w:hAnsi="Montserrat Regular"/>
-                          <w:sz w:val="28"/>
-                          <w:szCs w:val="28"/>
-                          <w:lang w:val="pt-PT"/>
-                        </w:rPr>
-                        <w:t xml:space="preserve">Dr. Ricardo Amaro, </w:t>
+                          <w:color w:val="EE0000"/>
+                          <w:sz w:val="28"/>
+                          <w:szCs w:val="28"/>
+                          <w:lang w:val="pt-PT"/>
+                        </w:rPr>
+                        <w:t>Setembro</w:t>
                       </w:r>
                       <w:r>
                         <w:rPr>
@@ -2524,77 +2266,7 @@
                           <w:szCs w:val="28"/>
                           <w:lang w:val="pt-PT"/>
                         </w:rPr>
-                        <w:t>[categoria],</w:t>
-                      </w:r>
-                      <w:r>
-                        <w:rPr>
-                          <w:rFonts w:ascii="Montserrat Regular" w:eastAsia="Montserrat Regular" w:hAnsi="Montserrat Regular" w:cs="Montserrat Regular"/>
-                          <w:color w:val="EE0000"/>
-                          <w:sz w:val="28"/>
-                          <w:szCs w:val="28"/>
-                          <w:lang w:val="pt-PT"/>
-                        </w:rPr>
-                        <w:t xml:space="preserve"> </w:t>
-                      </w:r>
-                      <w:r>
-                        <w:rPr>
-                          <w:rFonts w:ascii="Montserrat Regular" w:eastAsia="Montserrat Regular" w:hAnsi="Montserrat Regular" w:cs="Montserrat Regular"/>
-                          <w:sz w:val="28"/>
-                          <w:szCs w:val="28"/>
-                          <w:lang w:val="pt-PT"/>
-                        </w:rPr>
-                        <w:t>ISCTE-IUL</w:t>
-                      </w:r>
-                    </w:p>
-                    <w:p>
-                      <w:pPr>
-                        <w:pStyle w:val="Body"/>
-                        <w:rPr>
-                          <w:rFonts w:ascii="Montserrat Regular" w:eastAsia="Montserrat Regular" w:hAnsi="Montserrat Regular" w:cs="Montserrat Regular"/>
-                          <w:sz w:val="28"/>
-                          <w:szCs w:val="28"/>
-                          <w:lang w:val="pt-PT"/>
-                        </w:rPr>
-                      </w:pPr>
-                    </w:p>
-                    <w:p>
-                      <w:pPr>
-                        <w:pStyle w:val="Body"/>
-                        <w:rPr>
-                          <w:rFonts w:ascii="Montserrat Regular" w:eastAsia="Montserrat Regular" w:hAnsi="Montserrat Regular" w:cs="Montserrat Regular"/>
-                          <w:sz w:val="28"/>
-                          <w:szCs w:val="28"/>
-                          <w:lang w:val="pt-PT"/>
-                        </w:rPr>
-                      </w:pPr>
-                    </w:p>
-                    <w:p>
-                      <w:pPr>
-                        <w:pStyle w:val="Body"/>
-                        <w:rPr>
-                          <w:rFonts w:ascii="Montserrat Regular" w:eastAsia="Montserrat Regular" w:hAnsi="Montserrat Regular" w:cs="Montserrat Regular"/>
-                          <w:sz w:val="28"/>
-                          <w:szCs w:val="28"/>
-                          <w:lang w:val="pt-PT"/>
-                        </w:rPr>
-                      </w:pPr>
-                    </w:p>
-                    <w:p>
-                      <w:pPr>
-                        <w:pStyle w:val="Body"/>
-                        <w:rPr>
-                          <w:lang w:val="pt-PT"/>
-                        </w:rPr>
-                      </w:pPr>
-                      <w:r>
-                        <w:rPr>
-                          <w:rFonts w:ascii="Montserrat Regular" w:hAnsi="Montserrat Regular"/>
-                          <w:color w:val="EE0000"/>
-                          <w:sz w:val="28"/>
-                          <w:szCs w:val="28"/>
-                          <w:lang w:val="pt-PT"/>
-                        </w:rPr>
-                        <w:t>Junho,</w:t>
+                        <w:t>,</w:t>
                       </w:r>
                       <w:r>
                         <w:rPr>
@@ -6781,6 +6453,7 @@
   <w:style w:type="character" w:default="1" w:styleId="DefaultParagraphFont">
     <w:name w:val="Default Paragraph Font"/>
     <w:uiPriority w:val="1"/>
+    <w:semiHidden/>
     <w:unhideWhenUsed/>
   </w:style>
   <w:style w:type="table" w:default="1" w:styleId="TableNormal">

</xml_diff>